<commit_message>
docs(test-plan): align US-008, US-012 and US-015 cases with the story decisions
- UT-33: unticking a correction keeps the record and sets it to absent
- UT-65: adds a name shared by two learners, which is never guessed
- UT-66: says what the wrong-name counter keeps (keyed hashes, one hour)
  besides the attendance record
- UT-67: another phone on the same Wi-Fi still signs in; an address is
  blocked only after 50 wrong names
- 6.4: asks the Kaiārahi about the decision to hide unreviewed Māori
  material from learners only
- Section 1 notes the update

Refs: US-008, US-012, US-015
</commit_message>
<xml_diff>
--- a/docs/system_test/Test Plan – Ako.docx
+++ b/docs/system_test/Test Plan – Ako.docx
@@ -69,7 +69,7 @@
         <w:t xml:space="preserve">Source of truth:</w:t>
       </w:r>
       <w:r>
-        <w:t xml:space="preserve"> the acceptance criteria on each story card in MSE800_User_Stories_Oct19.docx, the requirements specification and the UI design document. Message text must match the UI message catalogue exactly.</w:t>
+        <w:t xml:space="preserve"> the acceptance criteria on each story card in MSE800_User_Stories_Oct19.docx, the requirements specification and the UI design document. Message text must match the UI message catalogue exactly. Updated 26 October 2026: UT-33, UT-65 to UT-67 and section 6.4 follow the decisions recorded in the story notes (US-008, US-012, US-015).</w:t>
       </w:r>
     </w:p>
     <w:p>
@@ -3214,7 +3214,7 @@
           <w:p>
             <w:pPr/>
             <w:r>
-              <w:t xml:space="preserve">Record removed, count falls by 1, change logged</w:t>
+              <w:t xml:space="preserve">Record kept and set to absent (not deleted), count falls by 1, change logged</w:t>
             </w:r>
           </w:p>
         </w:tc>
@@ -5436,7 +5436,7 @@
           <w:p>
             <w:pPr/>
             <w:r>
-              <w:t xml:space="preserve">Name that matches; name that does not; same name twice</w:t>
+              <w:t xml:space="preserve">Name that matches; name that does not; the same learner twice; a name shared by two learners</w:t>
             </w:r>
           </w:p>
         </w:tc>
@@ -5447,7 +5447,7 @@
           <w:p>
             <w:pPr/>
             <w:r>
-              <w:t xml:space="preserve">Match gives Present with the time. No match gives "We could not find that name. Please ask the teacher". Second sign-in gives "Already signed in"</w:t>
+              <w:t xml:space="preserve">Match gives Present with the time. No match gives "We could not find that name. Please ask the teacher". Second sign-in gives "Already signed in". A shared name is never guessed: it gives the same message, and the teacher ticks the right learner</w:t>
             </w:r>
           </w:p>
         </w:tc>
@@ -5493,7 +5493,7 @@
           <w:p>
             <w:pPr/>
             <w:r>
-              <w:t xml:space="preserve">Inspect the stored record</w:t>
+              <w:t xml:space="preserve">Inspect the stored attendance record and the wrong-name counter</w:t>
             </w:r>
           </w:p>
         </w:tc>
@@ -5504,7 +5504,7 @@
           <w:p>
             <w:pPr/>
             <w:r>
-              <w:t xml:space="preserve">Only name and time. No location or device detail</w:t>
+              <w:t xml:space="preserve">The attendance record holds only the learner, the time and the teacher who opened check-in. No location or device detail. The wrong-name counter keeps only keyed hashes of the phone's random id and of the address, deleted after an hour</w:t>
             </w:r>
           </w:p>
         </w:tc>
@@ -5550,7 +5550,7 @@
           <w:p>
             <w:pPr/>
             <w:r>
-              <w:t xml:space="preserve">10 wrong names, then an 11th, from one device within 10 minutes</w:t>
+              <w:t xml:space="preserve">10 wrong names, then an 11th, from one phone within 10 minutes; then a real name from another phone on the same Wi-Fi</w:t>
             </w:r>
           </w:p>
         </w:tc>
@@ -5561,7 +5561,7 @@
           <w:p>
             <w:pPr/>
             <w:r>
-              <w:t xml:space="preserve">The 11th is blocked for 10 minutes</w:t>
+              <w:t xml:space="preserve">The 11th is blocked for 10 minutes. The other phone still signs in. An address is blocked only after 50 wrong names</w:t>
             </w:r>
           </w:p>
         </w:tc>
@@ -9249,7 +9249,7 @@
           <w:p>
             <w:pPr/>
             <w:r>
-              <w:t xml:space="preserve">Is te reo shown correctly with macrons? Should unreviewed Māori material be hidden from learners (US-013)? Is the name Ako used respectfully? Is learner data minimal (NFR-05)?</w:t>
+              <w:t xml:space="preserve">Is te reo shown correctly with macrons? Is it right to hide unreviewed Māori material from learners only, as the team decided on 23 October (US-008, US-013)? Is the name Ako used respectfully? Is learner data minimal (NFR-05)?</w:t>
             </w:r>
           </w:p>
         </w:tc>

</xml_diff>

<commit_message>
docs(test-plan): show what is built and how tests run now
- Section 1: all 8 Later stories were built in Sprint 3, so their cases
  are run too; the "Later" labels keep the original plan. The design
  note points to database/README.md and database-schema.md, and the
  story card file name is corrected
- Section 3: throwaway volumes or the Docker test environment instead
  of a rebuilt database; there is no shared data script, each test
  creates its own made-up data; phone pages are US-009 to US-013
- Section 7.3: rows for US-007, 009, 010, 011, 012, 013, 016 and 017,
  with cases from section 8 and criteria counts from the story cards;
  results are left for the testers
- Section 9: the open-design and unbuilt-Later risks are closed

The other stories' cases and results are not changed.
</commit_message>
<xml_diff>
--- a/docs/system_test/Test Plan – Ako.docx
+++ b/docs/system_test/Test Plan – Ako.docx
@@ -51,7 +51,7 @@
         <w:t xml:space="preserve">In scope:</w:t>
       </w:r>
       <w:r>
-        <w:t xml:space="preserve"> the 9 first-release stories (US-001, 002, 003, 004, 005, 006, 008, 014, 015; 31 points) get full testing in Sprints 1 to 3. The 8 Later stories (US-007, 009, 010, 011, 012, 013, 016, 017) have test cases written now and are run only if the story is built.</w:t>
+        <w:t xml:space="preserve"> the 9 first-release stories (US-001, 002, 003, 004, 005, 006, 008, 014, 015; 31 points) get full testing in Sprints 1 to 3. The 8 Later stories (US-007, 009, 010, 011, 012, 013, 016, 017) have test cases written now and are run only if the story is built. Update 26 October 2026: all 8 Later stories were built in Sprint 3, so their test cases are run as well and have rows in section 7.3. The "Later" labels in this plan show the original plan.</w:t>
       </w:r>
     </w:p>
     <w:p>
@@ -69,7 +69,7 @@
         <w:t xml:space="preserve">Source of truth:</w:t>
       </w:r>
       <w:r>
-        <w:t xml:space="preserve"> the acceptance criteria on each story card in MSE800_User_Stories_Oct19.docx, the requirements specification and the UI design document. Message text must match the UI message catalogue exactly. Updated 26 October 2026: UT-33, UT-65 to UT-67 and section 6.4 follow the decisions recorded in the story notes (US-008, US-012, US-015).</w:t>
+        <w:t xml:space="preserve"> the acceptance criteria on each story card in MSE800_User_Stories.docx, the requirements specification and the UI design document. Message text must match the UI message catalogue exactly. Updated 26 October 2026: UT-33, UT-65 to UT-67 and section 6.4 follow the decisions recorded in the story notes (US-008, US-012, US-015).</w:t>
       </w:r>
     </w:p>
     <w:p>
@@ -105,7 +105,7 @@
         <w:t xml:space="preserve">Design is still open:</w:t>
       </w:r>
       <w:r>
-        <w:t xml:space="preserve"> class and table names will be confirmed at the design meeting on 20 October. Test cases below name modules by responsibility, so they stay valid when names change.</w:t>
+        <w:t xml:space="preserve"> class and table names will be confirmed at the design meeting on 20 October. Test cases below name modules by responsibility, so they stay valid when names change. Update 26 October 2026: the design is settled; tables and columns are in database/README.md and database/database-schema.md.</w:t>
       </w:r>
     </w:p>
     <w:p>
@@ -674,7 +674,7 @@
           <w:p>
             <w:pPr/>
             <w:r>
-              <w:t xml:space="preserve">A temporary or dedicated test database, rebuilt from the initialization script before each run. Never the demo or production file</w:t>
+              <w:t xml:space="preserve">Throwaway database volumes for each run (tests/system/README.md), or the isolated Docker test environment (tests/docker/README.md). Each service creates its tables when it starts. Never the demo data or real data</w:t>
             </w:r>
           </w:p>
         </w:tc>
@@ -698,7 +698,7 @@
           <w:p>
             <w:pPr/>
             <w:r>
-              <w:t xml:space="preserve">About 60 generated learners (some with the same name, one with a 100-character and one with a 101-character name, some with macrons such as Tāne), 2 coordinators, 4 teachers, 1 deactivated teacher, 12 past sessions with attendance, 10 lessons (3 with Māori content: not reviewed, reviewed, files changed after review), a valid 10-row CSV and bad CSV files. A script generates it so every tester starts from the same state</w:t>
+              <w:t xml:space="preserve">About 60 generated learners (some with the same name, one with a 100-character and one with a 101-character name, some with macrons such as Tāne), 2 coordinators, 4 teachers, 1 deactivated teacher, 12 past sessions with attendance, 10 lessons (3 with Māori content: not reviewed, reviewed, files changed after review), a valid 10-row CSV and bad CSV files. There is no shared data script: each automated test creates the made-up learners, classes, lessons and accounts it needs, with random suffixes, so it runs on any throwaway database; each manual script in docs/system_test lists the data to add before the run</w:t>
             </w:r>
           </w:p>
         </w:tc>
@@ -746,7 +746,7 @@
           <w:p>
             <w:pPr/>
             <w:r>
-              <w:t xml:space="preserve">Current phone browser at 360 px wide for the public and learner pages (Later stories)</w:t>
+              <w:t xml:space="preserve">Current phone browser at 360 px wide for the public and learner pages (US-009 to US-013)</w:t>
             </w:r>
           </w:p>
         </w:tc>
@@ -10349,6 +10349,65 @@
           <w:p>
             <w:pPr/>
             <w:r>
+              <w:t xml:space="preserve">US-007 Find and copy lessons</w:t>
+            </w:r>
+          </w:p>
+        </w:tc>
+        <w:tc>
+          <w:tcPr>
+            <w:tcW w:w="3037" w:type="dxa"/>
+          </w:tcPr>
+          <w:p>
+            <w:pPr/>
+            <w:r>
+              <w:t xml:space="preserve">UT-49, UT-50, ST-03 (extend), UA-04 (extend)</w:t>
+            </w:r>
+          </w:p>
+        </w:tc>
+        <w:tc>
+          <w:tcPr>
+            <w:tcW w:w="1027" w:type="dxa"/>
+          </w:tcPr>
+          <w:p>
+            <w:pPr/>
+            <w:r>
+              <w:t xml:space="preserve">/ 5</w:t>
+            </w:r>
+          </w:p>
+        </w:tc>
+        <w:tc>
+          <w:tcPr>
+            <w:tcW w:w="909" w:type="dxa"/>
+          </w:tcPr>
+          <w:p>
+            <w:pPr/>
+          </w:p>
+        </w:tc>
+        <w:tc>
+          <w:tcPr>
+            <w:tcW w:w="720" w:type="dxa"/>
+          </w:tcPr>
+          <w:p>
+            <w:pPr/>
+          </w:p>
+        </w:tc>
+        <w:tc>
+          <w:tcPr>
+            <w:tcW w:w="909" w:type="dxa"/>
+          </w:tcPr>
+          <w:p>
+            <w:pPr/>
+          </w:p>
+        </w:tc>
+      </w:tr>
+      <w:tr>
+        <w:tc>
+          <w:tcPr>
+            <w:tcW w:w="2758" w:type="dxa"/>
+          </w:tcPr>
+          <w:p>
+            <w:pPr/>
+            <w:r>
               <w:t xml:space="preserve">US-008 Flag Māori content</w:t>
             </w:r>
           </w:p>
@@ -10408,6 +10467,301 @@
           <w:p>
             <w:pPr/>
             <w:r>
+              <w:t xml:space="preserve">US-009 View club information</w:t>
+            </w:r>
+          </w:p>
+        </w:tc>
+        <w:tc>
+          <w:tcPr>
+            <w:tcW w:w="3037" w:type="dxa"/>
+          </w:tcPr>
+          <w:p>
+            <w:pPr/>
+            <w:r>
+              <w:t xml:space="preserve">ST-15, UA-11</w:t>
+            </w:r>
+          </w:p>
+        </w:tc>
+        <w:tc>
+          <w:tcPr>
+            <w:tcW w:w="1027" w:type="dxa"/>
+          </w:tcPr>
+          <w:p>
+            <w:pPr/>
+            <w:r>
+              <w:t xml:space="preserve">/ 5</w:t>
+            </w:r>
+          </w:p>
+        </w:tc>
+        <w:tc>
+          <w:tcPr>
+            <w:tcW w:w="909" w:type="dxa"/>
+          </w:tcPr>
+          <w:p>
+            <w:pPr/>
+          </w:p>
+        </w:tc>
+        <w:tc>
+          <w:tcPr>
+            <w:tcW w:w="720" w:type="dxa"/>
+          </w:tcPr>
+          <w:p>
+            <w:pPr/>
+          </w:p>
+        </w:tc>
+        <w:tc>
+          <w:tcPr>
+            <w:tcW w:w="909" w:type="dxa"/>
+          </w:tcPr>
+          <w:p>
+            <w:pPr/>
+          </w:p>
+        </w:tc>
+      </w:tr>
+      <w:tr>
+        <w:tc>
+          <w:tcPr>
+            <w:tcW w:w="2758" w:type="dxa"/>
+          </w:tcPr>
+          <w:p>
+            <w:pPr/>
+            <w:r>
+              <w:t xml:space="preserve">US-010 Register interest</w:t>
+            </w:r>
+          </w:p>
+        </w:tc>
+        <w:tc>
+          <w:tcPr>
+            <w:tcW w:w="3037" w:type="dxa"/>
+          </w:tcPr>
+          <w:p>
+            <w:pPr/>
+            <w:r>
+              <w:t xml:space="preserve">UT-61, UT-62, ST-15, UA-11</w:t>
+            </w:r>
+          </w:p>
+        </w:tc>
+        <w:tc>
+          <w:tcPr>
+            <w:tcW w:w="1027" w:type="dxa"/>
+          </w:tcPr>
+          <w:p>
+            <w:pPr/>
+            <w:r>
+              <w:t xml:space="preserve">/ 5</w:t>
+            </w:r>
+          </w:p>
+        </w:tc>
+        <w:tc>
+          <w:tcPr>
+            <w:tcW w:w="909" w:type="dxa"/>
+          </w:tcPr>
+          <w:p>
+            <w:pPr/>
+          </w:p>
+        </w:tc>
+        <w:tc>
+          <w:tcPr>
+            <w:tcW w:w="720" w:type="dxa"/>
+          </w:tcPr>
+          <w:p>
+            <w:pPr/>
+          </w:p>
+        </w:tc>
+        <w:tc>
+          <w:tcPr>
+            <w:tcW w:w="909" w:type="dxa"/>
+          </w:tcPr>
+          <w:p>
+            <w:pPr/>
+          </w:p>
+        </w:tc>
+      </w:tr>
+      <w:tr>
+        <w:tc>
+          <w:tcPr>
+            <w:tcW w:w="2758" w:type="dxa"/>
+          </w:tcPr>
+          <w:p>
+            <w:pPr/>
+            <w:r>
+              <w:t xml:space="preserve">US-011 Open check-in with a QR code</w:t>
+            </w:r>
+          </w:p>
+        </w:tc>
+        <w:tc>
+          <w:tcPr>
+            <w:tcW w:w="3037" w:type="dxa"/>
+          </w:tcPr>
+          <w:p>
+            <w:pPr/>
+            <w:r>
+              <w:t xml:space="preserve">UT-63, UT-64, ST-14, UA-12</w:t>
+            </w:r>
+          </w:p>
+        </w:tc>
+        <w:tc>
+          <w:tcPr>
+            <w:tcW w:w="1027" w:type="dxa"/>
+          </w:tcPr>
+          <w:p>
+            <w:pPr/>
+            <w:r>
+              <w:t xml:space="preserve">/ 6</w:t>
+            </w:r>
+          </w:p>
+        </w:tc>
+        <w:tc>
+          <w:tcPr>
+            <w:tcW w:w="909" w:type="dxa"/>
+          </w:tcPr>
+          <w:p>
+            <w:pPr/>
+          </w:p>
+        </w:tc>
+        <w:tc>
+          <w:tcPr>
+            <w:tcW w:w="720" w:type="dxa"/>
+          </w:tcPr>
+          <w:p>
+            <w:pPr/>
+          </w:p>
+        </w:tc>
+        <w:tc>
+          <w:tcPr>
+            <w:tcW w:w="909" w:type="dxa"/>
+          </w:tcPr>
+          <w:p>
+            <w:pPr/>
+          </w:p>
+        </w:tc>
+      </w:tr>
+      <w:tr>
+        <w:tc>
+          <w:tcPr>
+            <w:tcW w:w="2758" w:type="dxa"/>
+          </w:tcPr>
+          <w:p>
+            <w:pPr/>
+            <w:r>
+              <w:t xml:space="preserve">US-012 Sign in by scanning</w:t>
+            </w:r>
+          </w:p>
+        </w:tc>
+        <w:tc>
+          <w:tcPr>
+            <w:tcW w:w="3037" w:type="dxa"/>
+          </w:tcPr>
+          <w:p>
+            <w:pPr/>
+            <w:r>
+              <w:t xml:space="preserve">UT-65 to 67, ST-14, UA-12</w:t>
+            </w:r>
+          </w:p>
+        </w:tc>
+        <w:tc>
+          <w:tcPr>
+            <w:tcW w:w="1027" w:type="dxa"/>
+          </w:tcPr>
+          <w:p>
+            <w:pPr/>
+            <w:r>
+              <w:t xml:space="preserve">/ 6</w:t>
+            </w:r>
+          </w:p>
+        </w:tc>
+        <w:tc>
+          <w:tcPr>
+            <w:tcW w:w="909" w:type="dxa"/>
+          </w:tcPr>
+          <w:p>
+            <w:pPr/>
+          </w:p>
+        </w:tc>
+        <w:tc>
+          <w:tcPr>
+            <w:tcW w:w="720" w:type="dxa"/>
+          </w:tcPr>
+          <w:p>
+            <w:pPr/>
+          </w:p>
+        </w:tc>
+        <w:tc>
+          <w:tcPr>
+            <w:tcW w:w="909" w:type="dxa"/>
+          </w:tcPr>
+          <w:p>
+            <w:pPr/>
+          </w:p>
+        </w:tc>
+      </w:tr>
+      <w:tr>
+        <w:tc>
+          <w:tcPr>
+            <w:tcW w:w="2758" w:type="dxa"/>
+          </w:tcPr>
+          <w:p>
+            <w:pPr/>
+            <w:r>
+              <w:t xml:space="preserve">US-013 See lesson materials</w:t>
+            </w:r>
+          </w:p>
+        </w:tc>
+        <w:tc>
+          <w:tcPr>
+            <w:tcW w:w="3037" w:type="dxa"/>
+          </w:tcPr>
+          <w:p>
+            <w:pPr/>
+            <w:r>
+              <w:t xml:space="preserve">UT-68, ST-14, UA-12</w:t>
+            </w:r>
+          </w:p>
+        </w:tc>
+        <w:tc>
+          <w:tcPr>
+            <w:tcW w:w="1027" w:type="dxa"/>
+          </w:tcPr>
+          <w:p>
+            <w:pPr/>
+            <w:r>
+              <w:t xml:space="preserve">/ 6</w:t>
+            </w:r>
+          </w:p>
+        </w:tc>
+        <w:tc>
+          <w:tcPr>
+            <w:tcW w:w="909" w:type="dxa"/>
+          </w:tcPr>
+          <w:p>
+            <w:pPr/>
+          </w:p>
+        </w:tc>
+        <w:tc>
+          <w:tcPr>
+            <w:tcW w:w="720" w:type="dxa"/>
+          </w:tcPr>
+          <w:p>
+            <w:pPr/>
+          </w:p>
+        </w:tc>
+        <w:tc>
+          <w:tcPr>
+            <w:tcW w:w="909" w:type="dxa"/>
+          </w:tcPr>
+          <w:p>
+            <w:pPr/>
+          </w:p>
+        </w:tc>
+      </w:tr>
+      <w:tr>
+        <w:tc>
+          <w:tcPr>
+            <w:tcW w:w="2758" w:type="dxa"/>
+          </w:tcPr>
+          <w:p>
+            <w:pPr/>
+            <w:r>
               <w:t xml:space="preserve">US-014 Manage class sessions</w:t>
             </w:r>
           </w:p>
@@ -10490,6 +10844,124 @@
             <w:pPr/>
             <w:r>
               <w:t xml:space="preserve">/ 4</w:t>
+            </w:r>
+          </w:p>
+        </w:tc>
+        <w:tc>
+          <w:tcPr>
+            <w:tcW w:w="909" w:type="dxa"/>
+          </w:tcPr>
+          <w:p>
+            <w:pPr/>
+          </w:p>
+        </w:tc>
+        <w:tc>
+          <w:tcPr>
+            <w:tcW w:w="720" w:type="dxa"/>
+          </w:tcPr>
+          <w:p>
+            <w:pPr/>
+          </w:p>
+        </w:tc>
+        <w:tc>
+          <w:tcPr>
+            <w:tcW w:w="909" w:type="dxa"/>
+          </w:tcPr>
+          <w:p>
+            <w:pPr/>
+          </w:p>
+        </w:tc>
+      </w:tr>
+      <w:tr>
+        <w:tc>
+          <w:tcPr>
+            <w:tcW w:w="2758" w:type="dxa"/>
+          </w:tcPr>
+          <w:p>
+            <w:pPr/>
+            <w:r>
+              <w:t xml:space="preserve">US-016 View a learner's attendance history</w:t>
+            </w:r>
+          </w:p>
+        </w:tc>
+        <w:tc>
+          <w:tcPr>
+            <w:tcW w:w="3037" w:type="dxa"/>
+          </w:tcPr>
+          <w:p>
+            <w:pPr/>
+            <w:r>
+              <w:t xml:space="preserve">UT-36 to 38, ST-04 (extend), UA-06 (extend)</w:t>
+            </w:r>
+          </w:p>
+        </w:tc>
+        <w:tc>
+          <w:tcPr>
+            <w:tcW w:w="1027" w:type="dxa"/>
+          </w:tcPr>
+          <w:p>
+            <w:pPr/>
+            <w:r>
+              <w:t xml:space="preserve">/ 4</w:t>
+            </w:r>
+          </w:p>
+        </w:tc>
+        <w:tc>
+          <w:tcPr>
+            <w:tcW w:w="909" w:type="dxa"/>
+          </w:tcPr>
+          <w:p>
+            <w:pPr/>
+          </w:p>
+        </w:tc>
+        <w:tc>
+          <w:tcPr>
+            <w:tcW w:w="720" w:type="dxa"/>
+          </w:tcPr>
+          <w:p>
+            <w:pPr/>
+          </w:p>
+        </w:tc>
+        <w:tc>
+          <w:tcPr>
+            <w:tcW w:w="909" w:type="dxa"/>
+          </w:tcPr>
+          <w:p>
+            <w:pPr/>
+          </w:p>
+        </w:tc>
+      </w:tr>
+      <w:tr>
+        <w:tc>
+          <w:tcPr>
+            <w:tcW w:w="2758" w:type="dxa"/>
+          </w:tcPr>
+          <w:p>
+            <w:pPr/>
+            <w:r>
+              <w:t xml:space="preserve">US-017 Import learners from CSV</w:t>
+            </w:r>
+          </w:p>
+        </w:tc>
+        <w:tc>
+          <w:tcPr>
+            <w:tcW w:w="3037" w:type="dxa"/>
+          </w:tcPr>
+          <w:p>
+            <w:pPr/>
+            <w:r>
+              <w:t xml:space="preserve">UT-55 to 60, ST-13, UA-13</w:t>
+            </w:r>
+          </w:p>
+        </w:tc>
+        <w:tc>
+          <w:tcPr>
+            <w:tcW w:w="1027" w:type="dxa"/>
+          </w:tcPr>
+          <w:p>
+            <w:pPr/>
+            <w:r>
+              <w:t xml:space="preserve">/ 5</w:t>
             </w:r>
           </w:p>
         </w:tc>
@@ -10522,7 +10994,7 @@
     <w:p>
       <w:pPr/>
       <w:r>
-        <w:t xml:space="preserve">Later stories get the same kind of row when they are built. Use the cases in section 8.</w:t>
+        <w:t xml:space="preserve">Rows for the stories first planned as Later were added on 26 October 2026, when they were built in Sprint 3. Their cases come from section 8.</w:t>
       </w:r>
     </w:p>
     <w:p>
@@ -11720,7 +12192,7 @@
           <w:p>
             <w:pPr/>
             <w:r>
-              <w:t xml:space="preserve">Keep cases tied to responsibilities. Update names after the 20 October design meeting</w:t>
+              <w:t xml:space="preserve">Closed 26 October 2026: the design is in database/README.md and database/database-schema.md. Cases stay tied to responsibilities</w:t>
             </w:r>
           </w:p>
         </w:tc>
@@ -11895,7 +12367,7 @@
           <w:p>
             <w:pPr/>
             <w:r>
-              <w:t xml:space="preserve">Say in the report which stories were not built and therefore not tested</w:t>
+              <w:t xml:space="preserve">Closed 26 October 2026: all 8 Later stories were built in Sprint 3 and have rows in section 7.3</w:t>
             </w:r>
           </w:p>
         </w:tc>

</xml_diff>

<commit_message>
docs(uat): record user test results and consultation
</commit_message>
<xml_diff>
--- a/docs/system_test/Test Plan – Ako.docx
+++ b/docs/system_test/Test Plan – Ako.docx
@@ -1,6 +1,6 @@
 
 <file path=word/document.xml><?xml version="1.0" encoding="utf-8"?>
-<w:document xmlns:mc="http://schemas.openxmlformats.org/markup-compatibility/2006" xmlns:w="http://schemas.openxmlformats.org/wordprocessingml/2006/main" xmlns:w14="http://schemas.microsoft.com/office/word/2010/wordml" mc:Ignorable="w14 w15 wp14">
+<w:document xmlns:wpc="http://schemas.microsoft.com/office/word/2010/wordprocessingCanvas" xmlns:cx="http://schemas.microsoft.com/office/drawing/2014/chartex" xmlns:cx1="http://schemas.microsoft.com/office/drawing/2015/9/8/chartex" xmlns:cx2="http://schemas.microsoft.com/office/drawing/2015/10/21/chartex" xmlns:cx3="http://schemas.microsoft.com/office/drawing/2016/5/9/chartex" xmlns:cx4="http://schemas.microsoft.com/office/drawing/2016/5/10/chartex" xmlns:cx5="http://schemas.microsoft.com/office/drawing/2016/5/11/chartex" xmlns:cx6="http://schemas.microsoft.com/office/drawing/2016/5/12/chartex" xmlns:cx7="http://schemas.microsoft.com/office/drawing/2016/5/13/chartex" xmlns:cx8="http://schemas.microsoft.com/office/drawing/2016/5/14/chartex" xmlns:mc="http://schemas.openxmlformats.org/markup-compatibility/2006" xmlns:o="urn:schemas-microsoft-com:office:office" xmlns:r="http://schemas.openxmlformats.org/officeDocument/2006/relationships" xmlns:m="http://schemas.openxmlformats.org/officeDocument/2006/math" xmlns:v="urn:schemas-microsoft-com:vml" xmlns:wp14="http://schemas.microsoft.com/office/word/2010/wordprocessingDrawing" xmlns:wp="http://schemas.openxmlformats.org/drawingml/2006/wordprocessingDrawing" xmlns:w="http://schemas.openxmlformats.org/wordprocessingml/2006/main" xmlns:w14="http://schemas.microsoft.com/office/word/2010/wordml" xmlns:w10="urn:schemas-microsoft-com:office:word" xmlns:w15="http://schemas.microsoft.com/office/word/2012/wordml" xmlns:wpg="http://schemas.microsoft.com/office/word/2010/wordprocessingGroup" xmlns:wpi="http://schemas.microsoft.com/office/word/2010/wordprocessingInk" xmlns:wne="http://schemas.microsoft.com/office/word/2006/wordml" xmlns:wps="http://schemas.microsoft.com/office/word/2010/wordprocessingShape" xmlns:wpsCustomData="http://www.wps.cn/officeDocument/2013/wpsCustomData" mc:Ignorable="w14 w15 wp14">
   <w:body>
     <w:p>
       <w:pPr>
@@ -11,14 +11,11 @@
       </w:r>
     </w:p>
     <w:p>
-      <w:r>
-        <w:t>Oct 19, 2026 · @Pei</w:t>
-      </w:r>
-    </w:p>
-    <w:p>
       <w:pPr>
         <w:pStyle w:val="3"/>
       </w:pPr>
+      <w:bookmarkStart w:id="0" w:name="_GoBack"/>
+      <w:bookmarkEnd w:id="0"/>
       <w:r>
         <w:t>1. Purpose and scope</w:t>
       </w:r>
@@ -342,7 +339,7 @@
           </w:tcPr>
           <w:p>
             <w:r>
-              <w:t>Sprint 3 (26 to 27 October), Kaiārahi session date to be set</w:t>
+              <w:t>Sprint 3 (26 to 27 October); Kaiārahi consultation held on 24 October 2026</w:t>
             </w:r>
           </w:p>
         </w:tc>
@@ -7090,7 +7087,7 @@
     </w:p>
     <w:p>
       <w:r>
-        <w:t>User acceptance testing asks whether people can do their real tasks with Ako, and whether the result is acceptable to the people it serves, including Māori communities (Task 7). The project has no live client and no real learners, so the tests use stand-in users, made-up data, and a Kaiārahi session that is still to be arranged.</w:t>
+        <w:t>User acceptance testing asks whether people can do their real tasks with Ako, and whether the result is acceptable to the people it serves, including Māori communities (Task 7). The project has no live client and no real learners, so the tests use stand-in users, made-up data, and a Kaiārahi consultation held on 24 October 2026 (section 6.4).</w:t>
       </w:r>
     </w:p>
     <w:p>
@@ -7320,7 +7317,7 @@
           </w:tcPr>
           <w:p>
             <w:r>
-              <w:t>The external cultural adviser. Sandhya is contacting them, and a session is still to be arranged</w:t>
+              <w:t>The external cultural adviser. Sandhya facilitated the consultation held on 24 October 2026</w:t>
             </w:r>
           </w:p>
         </w:tc>
@@ -7340,7 +7337,7 @@
           </w:tcPr>
           <w:p>
             <w:r>
-              <w:t>Acceptance criteria for Māori content. Nothing here may be reported as the Kaiārahi's approval until the session has been held and recorded</w:t>
+              <w:t>Acceptance criteria for Māori content. Consultation is not by itself approval; record endorsement only if explicitly given</w:t>
             </w:r>
           </w:p>
         </w:tc>
@@ -7428,12 +7425,11 @@
         </w:tblCellMar>
       </w:tblPr>
       <w:tblGrid>
-        <w:gridCol w:w="868"/>
-        <w:gridCol w:w="1423"/>
-        <w:gridCol w:w="2533"/>
-        <w:gridCol w:w="1501"/>
-        <w:gridCol w:w="1565"/>
-        <w:gridCol w:w="1470"/>
+        <w:gridCol w:w="1030"/>
+        <w:gridCol w:w="1688"/>
+        <w:gridCol w:w="3004"/>
+        <w:gridCol w:w="1780"/>
+        <w:gridCol w:w="1858"/>
       </w:tblGrid>
       <w:tr>
         <w:trPr>
@@ -7441,7 +7437,7 @@
         </w:trPr>
         <w:tc>
           <w:tcPr>
-            <w:tcW w:w="868" w:type="dxa"/>
+            <w:tcW w:w="1030" w:type="dxa"/>
             <w:shd w:val="clear" w:color="auto" w:fill="F2F2F2"/>
           </w:tcPr>
           <w:p>
@@ -7452,7 +7448,7 @@
         </w:tc>
         <w:tc>
           <w:tcPr>
-            <w:tcW w:w="1423" w:type="dxa"/>
+            <w:tcW w:w="1688" w:type="dxa"/>
             <w:shd w:val="clear" w:color="auto" w:fill="F2F2F2"/>
           </w:tcPr>
           <w:p>
@@ -7463,7 +7459,7 @@
         </w:tc>
         <w:tc>
           <w:tcPr>
-            <w:tcW w:w="2533" w:type="dxa"/>
+            <w:tcW w:w="3004" w:type="dxa"/>
             <w:shd w:val="clear" w:color="auto" w:fill="F2F2F2"/>
           </w:tcPr>
           <w:p>
@@ -7474,7 +7470,7 @@
         </w:tc>
         <w:tc>
           <w:tcPr>
-            <w:tcW w:w="1501" w:type="dxa"/>
+            <w:tcW w:w="1780" w:type="dxa"/>
             <w:shd w:val="clear" w:color="auto" w:fill="F2F2F2"/>
           </w:tcPr>
           <w:p>
@@ -7485,7 +7481,7 @@
         </w:tc>
         <w:tc>
           <w:tcPr>
-            <w:tcW w:w="1565" w:type="dxa"/>
+            <w:tcW w:w="1858" w:type="dxa"/>
             <w:shd w:val="clear" w:color="auto" w:fill="F2F2F2"/>
           </w:tcPr>
           <w:p>
@@ -7494,22 +7490,11 @@
             </w:r>
           </w:p>
         </w:tc>
-        <w:tc>
-          <w:tcPr>
-            <w:tcW w:w="1470" w:type="dxa"/>
-            <w:shd w:val="clear" w:color="auto" w:fill="F2F2F2"/>
-          </w:tcPr>
-          <w:p>
-            <w:r>
-              <w:t>Target time</w:t>
-            </w:r>
-          </w:p>
-        </w:tc>
-      </w:tr>
-      <w:tr>
-        <w:tc>
-          <w:tcPr>
-            <w:tcW w:w="868" w:type="dxa"/>
+      </w:tr>
+      <w:tr>
+        <w:tc>
+          <w:tcPr>
+            <w:tcW w:w="1030" w:type="dxa"/>
           </w:tcPr>
           <w:p>
             <w:r>
@@ -7519,7 +7504,7 @@
         </w:tc>
         <w:tc>
           <w:tcPr>
-            <w:tcW w:w="1423" w:type="dxa"/>
+            <w:tcW w:w="1688" w:type="dxa"/>
           </w:tcPr>
           <w:p>
             <w:r>
@@ -7529,7 +7514,7 @@
         </w:tc>
         <w:tc>
           <w:tcPr>
-            <w:tcW w:w="2533" w:type="dxa"/>
+            <w:tcW w:w="3004" w:type="dxa"/>
           </w:tcPr>
           <w:p>
             <w:r>
@@ -7539,7 +7524,7 @@
         </w:tc>
         <w:tc>
           <w:tcPr>
-            <w:tcW w:w="1501" w:type="dxa"/>
+            <w:tcW w:w="1780" w:type="dxa"/>
           </w:tcPr>
           <w:p>
             <w:r>
@@ -7549,7 +7534,7 @@
         </w:tc>
         <w:tc>
           <w:tcPr>
-            <w:tcW w:w="1565" w:type="dxa"/>
+            <w:tcW w:w="1858" w:type="dxa"/>
           </w:tcPr>
           <w:p>
             <w:r>
@@ -7557,21 +7542,11 @@
             </w:r>
           </w:p>
         </w:tc>
-        <w:tc>
-          <w:tcPr>
-            <w:tcW w:w="1470" w:type="dxa"/>
-          </w:tcPr>
-          <w:p>
-            <w:r>
-              <w:t>1 min</w:t>
-            </w:r>
-          </w:p>
-        </w:tc>
-      </w:tr>
-      <w:tr>
-        <w:tc>
-          <w:tcPr>
-            <w:tcW w:w="868" w:type="dxa"/>
+      </w:tr>
+      <w:tr>
+        <w:tc>
+          <w:tcPr>
+            <w:tcW w:w="1030" w:type="dxa"/>
           </w:tcPr>
           <w:p>
             <w:r>
@@ -7581,7 +7556,7 @@
         </w:tc>
         <w:tc>
           <w:tcPr>
-            <w:tcW w:w="1423" w:type="dxa"/>
+            <w:tcW w:w="1688" w:type="dxa"/>
           </w:tcPr>
           <w:p>
             <w:r>
@@ -7591,7 +7566,7 @@
         </w:tc>
         <w:tc>
           <w:tcPr>
-            <w:tcW w:w="2533" w:type="dxa"/>
+            <w:tcW w:w="3004" w:type="dxa"/>
           </w:tcPr>
           <w:p>
             <w:r>
@@ -7601,7 +7576,7 @@
         </w:tc>
         <w:tc>
           <w:tcPr>
-            <w:tcW w:w="1501" w:type="dxa"/>
+            <w:tcW w:w="1780" w:type="dxa"/>
           </w:tcPr>
           <w:p>
             <w:r>
@@ -7611,7 +7586,7 @@
         </w:tc>
         <w:tc>
           <w:tcPr>
-            <w:tcW w:w="1565" w:type="dxa"/>
+            <w:tcW w:w="1858" w:type="dxa"/>
           </w:tcPr>
           <w:p>
             <w:r>
@@ -7619,21 +7594,11 @@
             </w:r>
           </w:p>
         </w:tc>
-        <w:tc>
-          <w:tcPr>
-            <w:tcW w:w="1470" w:type="dxa"/>
-          </w:tcPr>
-          <w:p>
-            <w:r>
-              <w:t>3 min</w:t>
-            </w:r>
-          </w:p>
-        </w:tc>
-      </w:tr>
-      <w:tr>
-        <w:tc>
-          <w:tcPr>
-            <w:tcW w:w="868" w:type="dxa"/>
+      </w:tr>
+      <w:tr>
+        <w:tc>
+          <w:tcPr>
+            <w:tcW w:w="1030" w:type="dxa"/>
           </w:tcPr>
           <w:p>
             <w:r>
@@ -7643,7 +7608,7 @@
         </w:tc>
         <w:tc>
           <w:tcPr>
-            <w:tcW w:w="1423" w:type="dxa"/>
+            <w:tcW w:w="1688" w:type="dxa"/>
           </w:tcPr>
           <w:p>
             <w:r>
@@ -7653,7 +7618,7 @@
         </w:tc>
         <w:tc>
           <w:tcPr>
-            <w:tcW w:w="2533" w:type="dxa"/>
+            <w:tcW w:w="3004" w:type="dxa"/>
           </w:tcPr>
           <w:p>
             <w:r>
@@ -7663,7 +7628,7 @@
         </w:tc>
         <w:tc>
           <w:tcPr>
-            <w:tcW w:w="1501" w:type="dxa"/>
+            <w:tcW w:w="1780" w:type="dxa"/>
           </w:tcPr>
           <w:p>
             <w:r>
@@ -7673,7 +7638,7 @@
         </w:tc>
         <w:tc>
           <w:tcPr>
-            <w:tcW w:w="1565" w:type="dxa"/>
+            <w:tcW w:w="1858" w:type="dxa"/>
           </w:tcPr>
           <w:p>
             <w:r>
@@ -7681,21 +7646,11 @@
             </w:r>
           </w:p>
         </w:tc>
-        <w:tc>
-          <w:tcPr>
-            <w:tcW w:w="1470" w:type="dxa"/>
-          </w:tcPr>
-          <w:p>
-            <w:r>
-              <w:t>1 min</w:t>
-            </w:r>
-          </w:p>
-        </w:tc>
-      </w:tr>
-      <w:tr>
-        <w:tc>
-          <w:tcPr>
-            <w:tcW w:w="868" w:type="dxa"/>
+      </w:tr>
+      <w:tr>
+        <w:tc>
+          <w:tcPr>
+            <w:tcW w:w="1030" w:type="dxa"/>
           </w:tcPr>
           <w:p>
             <w:r>
@@ -7705,7 +7660,7 @@
         </w:tc>
         <w:tc>
           <w:tcPr>
-            <w:tcW w:w="1423" w:type="dxa"/>
+            <w:tcW w:w="1688" w:type="dxa"/>
           </w:tcPr>
           <w:p>
             <w:r>
@@ -7715,7 +7670,7 @@
         </w:tc>
         <w:tc>
           <w:tcPr>
-            <w:tcW w:w="2533" w:type="dxa"/>
+            <w:tcW w:w="3004" w:type="dxa"/>
           </w:tcPr>
           <w:p>
             <w:r>
@@ -7725,7 +7680,7 @@
         </w:tc>
         <w:tc>
           <w:tcPr>
-            <w:tcW w:w="1501" w:type="dxa"/>
+            <w:tcW w:w="1780" w:type="dxa"/>
           </w:tcPr>
           <w:p>
             <w:r>
@@ -7735,7 +7690,7 @@
         </w:tc>
         <w:tc>
           <w:tcPr>
-            <w:tcW w:w="1565" w:type="dxa"/>
+            <w:tcW w:w="1858" w:type="dxa"/>
           </w:tcPr>
           <w:p>
             <w:r>
@@ -7743,21 +7698,11 @@
             </w:r>
           </w:p>
         </w:tc>
-        <w:tc>
-          <w:tcPr>
-            <w:tcW w:w="1470" w:type="dxa"/>
-          </w:tcPr>
-          <w:p>
-            <w:r>
-              <w:t>4 min</w:t>
-            </w:r>
-          </w:p>
-        </w:tc>
-      </w:tr>
-      <w:tr>
-        <w:tc>
-          <w:tcPr>
-            <w:tcW w:w="868" w:type="dxa"/>
+      </w:tr>
+      <w:tr>
+        <w:tc>
+          <w:tcPr>
+            <w:tcW w:w="1030" w:type="dxa"/>
           </w:tcPr>
           <w:p>
             <w:r>
@@ -7767,7 +7712,7 @@
         </w:tc>
         <w:tc>
           <w:tcPr>
-            <w:tcW w:w="1423" w:type="dxa"/>
+            <w:tcW w:w="1688" w:type="dxa"/>
           </w:tcPr>
           <w:p>
             <w:r>
@@ -7777,7 +7722,7 @@
         </w:tc>
         <w:tc>
           <w:tcPr>
-            <w:tcW w:w="2533" w:type="dxa"/>
+            <w:tcW w:w="3004" w:type="dxa"/>
           </w:tcPr>
           <w:p>
             <w:r>
@@ -7787,7 +7732,7 @@
         </w:tc>
         <w:tc>
           <w:tcPr>
-            <w:tcW w:w="1501" w:type="dxa"/>
+            <w:tcW w:w="1780" w:type="dxa"/>
           </w:tcPr>
           <w:p>
             <w:r>
@@ -7797,7 +7742,7 @@
         </w:tc>
         <w:tc>
           <w:tcPr>
-            <w:tcW w:w="1565" w:type="dxa"/>
+            <w:tcW w:w="1858" w:type="dxa"/>
           </w:tcPr>
           <w:p>
             <w:r>
@@ -7805,21 +7750,11 @@
             </w:r>
           </w:p>
         </w:tc>
-        <w:tc>
-          <w:tcPr>
-            <w:tcW w:w="1470" w:type="dxa"/>
-          </w:tcPr>
-          <w:p>
-            <w:r>
-              <w:t>2 min</w:t>
-            </w:r>
-          </w:p>
-        </w:tc>
-      </w:tr>
-      <w:tr>
-        <w:tc>
-          <w:tcPr>
-            <w:tcW w:w="868" w:type="dxa"/>
+      </w:tr>
+      <w:tr>
+        <w:tc>
+          <w:tcPr>
+            <w:tcW w:w="1030" w:type="dxa"/>
           </w:tcPr>
           <w:p>
             <w:r>
@@ -7829,7 +7764,7 @@
         </w:tc>
         <w:tc>
           <w:tcPr>
-            <w:tcW w:w="1423" w:type="dxa"/>
+            <w:tcW w:w="1688" w:type="dxa"/>
           </w:tcPr>
           <w:p>
             <w:r>
@@ -7839,7 +7774,7 @@
         </w:tc>
         <w:tc>
           <w:tcPr>
-            <w:tcW w:w="2533" w:type="dxa"/>
+            <w:tcW w:w="3004" w:type="dxa"/>
           </w:tcPr>
           <w:p>
             <w:r>
@@ -7849,7 +7784,7 @@
         </w:tc>
         <w:tc>
           <w:tcPr>
-            <w:tcW w:w="1501" w:type="dxa"/>
+            <w:tcW w:w="1780" w:type="dxa"/>
           </w:tcPr>
           <w:p>
             <w:r>
@@ -7859,7 +7794,7 @@
         </w:tc>
         <w:tc>
           <w:tcPr>
-            <w:tcW w:w="1565" w:type="dxa"/>
+            <w:tcW w:w="1858" w:type="dxa"/>
           </w:tcPr>
           <w:p>
             <w:r>
@@ -7867,21 +7802,11 @@
             </w:r>
           </w:p>
         </w:tc>
-        <w:tc>
-          <w:tcPr>
-            <w:tcW w:w="1470" w:type="dxa"/>
-          </w:tcPr>
-          <w:p>
-            <w:r>
-              <w:t>3 min</w:t>
-            </w:r>
-          </w:p>
-        </w:tc>
-      </w:tr>
-      <w:tr>
-        <w:tc>
-          <w:tcPr>
-            <w:tcW w:w="868" w:type="dxa"/>
+      </w:tr>
+      <w:tr>
+        <w:tc>
+          <w:tcPr>
+            <w:tcW w:w="1030" w:type="dxa"/>
           </w:tcPr>
           <w:p>
             <w:r>
@@ -7891,7 +7816,7 @@
         </w:tc>
         <w:tc>
           <w:tcPr>
-            <w:tcW w:w="1423" w:type="dxa"/>
+            <w:tcW w:w="1688" w:type="dxa"/>
           </w:tcPr>
           <w:p>
             <w:r>
@@ -7901,7 +7826,7 @@
         </w:tc>
         <w:tc>
           <w:tcPr>
-            <w:tcW w:w="2533" w:type="dxa"/>
+            <w:tcW w:w="3004" w:type="dxa"/>
           </w:tcPr>
           <w:p>
             <w:r>
@@ -7911,7 +7836,7 @@
         </w:tc>
         <w:tc>
           <w:tcPr>
-            <w:tcW w:w="1501" w:type="dxa"/>
+            <w:tcW w:w="1780" w:type="dxa"/>
           </w:tcPr>
           <w:p>
             <w:r>
@@ -7921,7 +7846,7 @@
         </w:tc>
         <w:tc>
           <w:tcPr>
-            <w:tcW w:w="1565" w:type="dxa"/>
+            <w:tcW w:w="1858" w:type="dxa"/>
           </w:tcPr>
           <w:p>
             <w:r>
@@ -7929,21 +7854,11 @@
             </w:r>
           </w:p>
         </w:tc>
-        <w:tc>
-          <w:tcPr>
-            <w:tcW w:w="1470" w:type="dxa"/>
-          </w:tcPr>
-          <w:p>
-            <w:r>
-              <w:t>3 min</w:t>
-            </w:r>
-          </w:p>
-        </w:tc>
-      </w:tr>
-      <w:tr>
-        <w:tc>
-          <w:tcPr>
-            <w:tcW w:w="868" w:type="dxa"/>
+      </w:tr>
+      <w:tr>
+        <w:tc>
+          <w:tcPr>
+            <w:tcW w:w="1030" w:type="dxa"/>
           </w:tcPr>
           <w:p>
             <w:r>
@@ -7953,7 +7868,7 @@
         </w:tc>
         <w:tc>
           <w:tcPr>
-            <w:tcW w:w="1423" w:type="dxa"/>
+            <w:tcW w:w="1688" w:type="dxa"/>
           </w:tcPr>
           <w:p>
             <w:r>
@@ -7963,7 +7878,7 @@
         </w:tc>
         <w:tc>
           <w:tcPr>
-            <w:tcW w:w="2533" w:type="dxa"/>
+            <w:tcW w:w="3004" w:type="dxa"/>
           </w:tcPr>
           <w:p>
             <w:r>
@@ -7973,7 +7888,7 @@
         </w:tc>
         <w:tc>
           <w:tcPr>
-            <w:tcW w:w="1501" w:type="dxa"/>
+            <w:tcW w:w="1780" w:type="dxa"/>
           </w:tcPr>
           <w:p>
             <w:r>
@@ -7983,7 +7898,7 @@
         </w:tc>
         <w:tc>
           <w:tcPr>
-            <w:tcW w:w="1565" w:type="dxa"/>
+            <w:tcW w:w="1858" w:type="dxa"/>
           </w:tcPr>
           <w:p>
             <w:r>
@@ -7991,21 +7906,11 @@
             </w:r>
           </w:p>
         </w:tc>
-        <w:tc>
-          <w:tcPr>
-            <w:tcW w:w="1470" w:type="dxa"/>
-          </w:tcPr>
-          <w:p>
-            <w:r>
-              <w:t>4 min</w:t>
-            </w:r>
-          </w:p>
-        </w:tc>
-      </w:tr>
-      <w:tr>
-        <w:tc>
-          <w:tcPr>
-            <w:tcW w:w="868" w:type="dxa"/>
+      </w:tr>
+      <w:tr>
+        <w:tc>
+          <w:tcPr>
+            <w:tcW w:w="1030" w:type="dxa"/>
           </w:tcPr>
           <w:p>
             <w:r>
@@ -8015,7 +7920,7 @@
         </w:tc>
         <w:tc>
           <w:tcPr>
-            <w:tcW w:w="1423" w:type="dxa"/>
+            <w:tcW w:w="1688" w:type="dxa"/>
           </w:tcPr>
           <w:p>
             <w:r>
@@ -8025,7 +7930,7 @@
         </w:tc>
         <w:tc>
           <w:tcPr>
-            <w:tcW w:w="2533" w:type="dxa"/>
+            <w:tcW w:w="3004" w:type="dxa"/>
           </w:tcPr>
           <w:p>
             <w:r>
@@ -8035,7 +7940,7 @@
         </w:tc>
         <w:tc>
           <w:tcPr>
-            <w:tcW w:w="1501" w:type="dxa"/>
+            <w:tcW w:w="1780" w:type="dxa"/>
           </w:tcPr>
           <w:p>
             <w:r>
@@ -8045,7 +7950,7 @@
         </w:tc>
         <w:tc>
           <w:tcPr>
-            <w:tcW w:w="1565" w:type="dxa"/>
+            <w:tcW w:w="1858" w:type="dxa"/>
           </w:tcPr>
           <w:p>
             <w:r>
@@ -8053,21 +7958,11 @@
             </w:r>
           </w:p>
         </w:tc>
-        <w:tc>
-          <w:tcPr>
-            <w:tcW w:w="1470" w:type="dxa"/>
-          </w:tcPr>
-          <w:p>
-            <w:r>
-              <w:t>3 min</w:t>
-            </w:r>
-          </w:p>
-        </w:tc>
-      </w:tr>
-      <w:tr>
-        <w:tc>
-          <w:tcPr>
-            <w:tcW w:w="868" w:type="dxa"/>
+      </w:tr>
+      <w:tr>
+        <w:tc>
+          <w:tcPr>
+            <w:tcW w:w="1030" w:type="dxa"/>
           </w:tcPr>
           <w:p>
             <w:r>
@@ -8077,7 +7972,7 @@
         </w:tc>
         <w:tc>
           <w:tcPr>
-            <w:tcW w:w="1423" w:type="dxa"/>
+            <w:tcW w:w="1688" w:type="dxa"/>
           </w:tcPr>
           <w:p>
             <w:r>
@@ -8087,7 +7982,7 @@
         </w:tc>
         <w:tc>
           <w:tcPr>
-            <w:tcW w:w="2533" w:type="dxa"/>
+            <w:tcW w:w="3004" w:type="dxa"/>
           </w:tcPr>
           <w:p>
             <w:r>
@@ -8097,7 +7992,7 @@
         </w:tc>
         <w:tc>
           <w:tcPr>
-            <w:tcW w:w="1501" w:type="dxa"/>
+            <w:tcW w:w="1780" w:type="dxa"/>
           </w:tcPr>
           <w:p>
             <w:r>
@@ -8107,7 +8002,7 @@
         </w:tc>
         <w:tc>
           <w:tcPr>
-            <w:tcW w:w="1565" w:type="dxa"/>
+            <w:tcW w:w="1858" w:type="dxa"/>
           </w:tcPr>
           <w:p>
             <w:r>
@@ -8115,21 +8010,11 @@
             </w:r>
           </w:p>
         </w:tc>
-        <w:tc>
-          <w:tcPr>
-            <w:tcW w:w="1470" w:type="dxa"/>
-          </w:tcPr>
-          <w:p>
-            <w:r>
-              <w:t>1 min</w:t>
-            </w:r>
-          </w:p>
-        </w:tc>
-      </w:tr>
-      <w:tr>
-        <w:tc>
-          <w:tcPr>
-            <w:tcW w:w="868" w:type="dxa"/>
+      </w:tr>
+      <w:tr>
+        <w:tc>
+          <w:tcPr>
+            <w:tcW w:w="1030" w:type="dxa"/>
           </w:tcPr>
           <w:p>
             <w:r>
@@ -8139,7 +8024,7 @@
         </w:tc>
         <w:tc>
           <w:tcPr>
-            <w:tcW w:w="1423" w:type="dxa"/>
+            <w:tcW w:w="1688" w:type="dxa"/>
           </w:tcPr>
           <w:p>
             <w:r>
@@ -8149,7 +8034,7 @@
         </w:tc>
         <w:tc>
           <w:tcPr>
-            <w:tcW w:w="2533" w:type="dxa"/>
+            <w:tcW w:w="3004" w:type="dxa"/>
           </w:tcPr>
           <w:p>
             <w:r>
@@ -8159,7 +8044,7 @@
         </w:tc>
         <w:tc>
           <w:tcPr>
-            <w:tcW w:w="1501" w:type="dxa"/>
+            <w:tcW w:w="1780" w:type="dxa"/>
           </w:tcPr>
           <w:p>
             <w:r>
@@ -8169,29 +8054,19 @@
         </w:tc>
         <w:tc>
           <w:tcPr>
-            <w:tcW w:w="1565" w:type="dxa"/>
-          </w:tcPr>
-          <w:p>
-            <w:r>
-              <w:t>Finds time and place in 30 seconds and sends the form</w:t>
-            </w:r>
-          </w:p>
-        </w:tc>
-        <w:tc>
-          <w:tcPr>
-            <w:tcW w:w="1470" w:type="dxa"/>
-          </w:tcPr>
-          <w:p>
-            <w:r>
-              <w:t>3 min</w:t>
-            </w:r>
-          </w:p>
-        </w:tc>
-      </w:tr>
-      <w:tr>
-        <w:tc>
-          <w:tcPr>
-            <w:tcW w:w="868" w:type="dxa"/>
+            <w:tcW w:w="1858" w:type="dxa"/>
+          </w:tcPr>
+          <w:p>
+            <w:r>
+              <w:t>Finds time and place and sends the form</w:t>
+            </w:r>
+          </w:p>
+        </w:tc>
+      </w:tr>
+      <w:tr>
+        <w:tc>
+          <w:tcPr>
+            <w:tcW w:w="1030" w:type="dxa"/>
           </w:tcPr>
           <w:p>
             <w:r>
@@ -8201,7 +8076,7 @@
         </w:tc>
         <w:tc>
           <w:tcPr>
-            <w:tcW w:w="1423" w:type="dxa"/>
+            <w:tcW w:w="1688" w:type="dxa"/>
           </w:tcPr>
           <w:p>
             <w:r>
@@ -8211,7 +8086,7 @@
         </w:tc>
         <w:tc>
           <w:tcPr>
-            <w:tcW w:w="2533" w:type="dxa"/>
+            <w:tcW w:w="3004" w:type="dxa"/>
           </w:tcPr>
           <w:p>
             <w:r>
@@ -8221,7 +8096,7 @@
         </w:tc>
         <w:tc>
           <w:tcPr>
-            <w:tcW w:w="1501" w:type="dxa"/>
+            <w:tcW w:w="1780" w:type="dxa"/>
           </w:tcPr>
           <w:p>
             <w:r>
@@ -8231,7 +8106,7 @@
         </w:tc>
         <w:tc>
           <w:tcPr>
-            <w:tcW w:w="1565" w:type="dxa"/>
+            <w:tcW w:w="1858" w:type="dxa"/>
           </w:tcPr>
           <w:p>
             <w:r>
@@ -8239,21 +8114,11 @@
             </w:r>
           </w:p>
         </w:tc>
-        <w:tc>
-          <w:tcPr>
-            <w:tcW w:w="1470" w:type="dxa"/>
-          </w:tcPr>
-          <w:p>
-            <w:r>
-              <w:t>2 min</w:t>
-            </w:r>
-          </w:p>
-        </w:tc>
-      </w:tr>
-      <w:tr>
-        <w:tc>
-          <w:tcPr>
-            <w:tcW w:w="868" w:type="dxa"/>
+      </w:tr>
+      <w:tr>
+        <w:tc>
+          <w:tcPr>
+            <w:tcW w:w="1030" w:type="dxa"/>
           </w:tcPr>
           <w:p>
             <w:r>
@@ -8263,7 +8128,7 @@
         </w:tc>
         <w:tc>
           <w:tcPr>
-            <w:tcW w:w="1423" w:type="dxa"/>
+            <w:tcW w:w="1688" w:type="dxa"/>
           </w:tcPr>
           <w:p>
             <w:r>
@@ -8273,7 +8138,7 @@
         </w:tc>
         <w:tc>
           <w:tcPr>
-            <w:tcW w:w="2533" w:type="dxa"/>
+            <w:tcW w:w="3004" w:type="dxa"/>
           </w:tcPr>
           <w:p>
             <w:r>
@@ -8283,7 +8148,7 @@
         </w:tc>
         <w:tc>
           <w:tcPr>
-            <w:tcW w:w="1501" w:type="dxa"/>
+            <w:tcW w:w="1780" w:type="dxa"/>
           </w:tcPr>
           <w:p>
             <w:r>
@@ -8293,21 +8158,11 @@
         </w:tc>
         <w:tc>
           <w:tcPr>
-            <w:tcW w:w="1565" w:type="dxa"/>
+            <w:tcW w:w="1858" w:type="dxa"/>
           </w:tcPr>
           <w:p>
             <w:r>
               <w:t>Right counts shown</w:t>
-            </w:r>
-          </w:p>
-        </w:tc>
-        <w:tc>
-          <w:tcPr>
-            <w:tcW w:w="1470" w:type="dxa"/>
-          </w:tcPr>
-          <w:p>
-            <w:r>
-              <w:t>3 min</w:t>
             </w:r>
           </w:p>
         </w:tc>
@@ -8424,38 +8279,6 @@
           </w:tcPr>
           <w:p>
             <w:r>
-              <w:t>Time</w:t>
-            </w:r>
-          </w:p>
-        </w:tc>
-        <w:tc>
-          <w:tcPr>
-            <w:tcW w:w="4637" w:type="dxa"/>
-          </w:tcPr>
-          <w:p>
-            <w:r>
-              <w:t>Observer's stopwatch against the target times above</w:t>
-            </w:r>
-          </w:p>
-        </w:tc>
-        <w:tc>
-          <w:tcPr>
-            <w:tcW w:w="2349" w:type="dxa"/>
-          </w:tcPr>
-          <w:p>
-            <w:r>
-              <w:t>Median within 1.5 times the target</w:t>
-            </w:r>
-          </w:p>
-        </w:tc>
-      </w:tr>
-      <w:tr>
-        <w:tc>
-          <w:tcPr>
-            <w:tcW w:w="2374" w:type="dxa"/>
-          </w:tcPr>
-          <w:p>
-            <w:r>
               <w:t>Errors and confusion</w:t>
             </w:r>
           </w:p>
@@ -8586,7 +8409,7 @@
         <w:rPr>
           <w:b/>
         </w:rPr>
-        <w:t>UAT measurement results (fill from session evidence)</w:t>
+        <w:t>UAT measurement results (sessions on 27 Oct 2026)</w:t>
       </w:r>
     </w:p>
     <w:p>
@@ -8594,7 +8417,7 @@
         <w:spacing w:before="80" w:after="60"/>
       </w:pPr>
       <w:r>
-        <w:t>Enter observed figures from the UAT sessions. Do not infer task success, time, SUS or observation results from the story-level Pass entries in section 7.3.</w:t>
+        <w:t>Observed figures below are from the four sessions recorded in uat_user_test_results.md. Do not infer participant results from the story-level Pass entries in section 7.3.</w:t>
       </w:r>
     </w:p>
     <w:tbl>
@@ -8678,7 +8501,7 @@
           </w:tcPr>
           <w:p>
             <w:r>
-              <w:t>Completed alone: ___ / ___ tasks (___%). Any task failed by two participants in a row: ___.</w:t>
+              <w:t>Completed alone: 15 / 16 tasks (93.75%). Any task failed by two participants in a row: No.</w:t>
             </w:r>
           </w:p>
         </w:tc>
@@ -8691,7 +8514,7 @@
               <w:rPr>
                 <w:rFonts w:hint="eastAsia"/>
               </w:rPr>
-              <w:t>Observation sheets: ___. Observer: ___. Target: at least 80%; no repeated failure.</w:t>
+              <w:t>UAT user test records, sections 1–2. Observer: Pei. Target: at least 80%; no repeated failure.</w:t>
             </w:r>
           </w:p>
         </w:tc>
@@ -8703,7 +8526,7 @@
           </w:tcPr>
           <w:p>
             <w:r>
-              <w:t>Time</w:t>
+              <w:t>Errors and confusion</w:t>
             </w:r>
           </w:p>
         </w:tc>
@@ -8713,7 +8536,7 @@
           </w:tcPr>
           <w:p>
             <w:r>
-              <w:t>Median observed time ÷ target time: ___×.</w:t>
+              <w:t>Items observed: 1 (OBS-01). All logged and triaged: Yes (1/1).</w:t>
             </w:r>
           </w:p>
         </w:tc>
@@ -8723,7 +8546,7 @@
           </w:tcPr>
           <w:p>
             <w:r>
-              <w:t>Stopwatch records: ___. Observer: ___. Target: no more than 1.5×.</w:t>
+              <w:t>uat_user_test_results.md, section 3. Owner: Design Team; disposition: refine tag-input placeholder. Target: every item logged and triaged.</w:t>
             </w:r>
           </w:p>
         </w:tc>
@@ -8735,7 +8558,7 @@
           </w:tcPr>
           <w:p>
             <w:r>
-              <w:t>Errors and confusion</w:t>
+              <w:t>Satisfaction (SUS)</w:t>
             </w:r>
           </w:p>
         </w:tc>
@@ -8745,7 +8568,7 @@
           </w:tcPr>
           <w:p>
             <w:r>
-              <w:t>Items observed: ___. All logged and triaged: ___.</w:t>
+              <w:t>Participants: 4. Average score: 86.25 / 100.</w:t>
             </w:r>
           </w:p>
         </w:tc>
@@ -8755,7 +8578,7 @@
           </w:tcPr>
           <w:p>
             <w:r>
-              <w:t>Observation/defect log and owners: ___. Target: every item logged and triaged.</w:t>
+              <w:t>uat_user_test_results.md, section 4: four completed forms and scoring. Target: average at least 68.</w:t>
             </w:r>
           </w:p>
         </w:tc>
@@ -8767,7 +8590,7 @@
           </w:tcPr>
           <w:p>
             <w:r>
-              <w:t>Satisfaction (SUS)</w:t>
+              <w:t>Plain language</w:t>
             </w:r>
           </w:p>
         </w:tc>
@@ -8777,39 +8600,7 @@
           </w:tcPr>
           <w:p>
             <w:r>
-              <w:t>Participants: ___. Average score: ___ / 100.</w:t>
-            </w:r>
-          </w:p>
-        </w:tc>
-        <w:tc>
-          <w:tcPr>
-            <w:tcW w:w="2349" w:type="dxa"/>
-          </w:tcPr>
-          <w:p>
-            <w:r>
-              <w:t>Completed SUS forms / calculation: ___. Target: average at least 68.</w:t>
-            </w:r>
-          </w:p>
-        </w:tc>
-      </w:tr>
-      <w:tr>
-        <w:tc>
-          <w:tcPr>
-            <w:tcW w:w="2374" w:type="dxa"/>
-          </w:tcPr>
-          <w:p>
-            <w:r>
-              <w:t>Plain language</w:t>
-            </w:r>
-          </w:p>
-        </w:tc>
-        <w:tc>
-          <w:tcPr>
-            <w:tcW w:w="4637" w:type="dxa"/>
-          </w:tcPr>
-          <w:p>
-            <w:r>
-              <w:t>Messages misunderstood by two or more participants: ___.</w:t>
+              <w:t>Messages misunderstood by two or more participants: 0.</w:t>
             </w:r>
           </w:p>
         </w:tc>
@@ -8822,7 +8613,7 @@
               <w:rPr>
                 <w:rFonts w:hint="eastAsia"/>
               </w:rPr>
-              <w:t>Observation notes: ___. Observer: ___. Target: none.</w:t>
+              <w:t>uat_user_test_results.md, section 3. Observer: Pei. One UA-04 clarification request; no wording was misunderstood by two or more participants. Target: none.</w:t>
             </w:r>
           </w:p>
         </w:tc>
@@ -8875,7 +8666,7 @@
     </w:p>
     <w:p>
       <w:r>
-        <w:t>The rubric asks for documented consultation with a Kaiārahi at kickoff, requirements and acceptance testing. The consultation is still to be arranged. This plan prepares the session, and will record what happened without claiming any endorsement.</w:t>
+        <w:t>The rubric asks for documented consultation with a Kaiārahi at kickoff, requirements and acceptance testing. Sandhya facilitated the acceptance-stage consultation on Saturday 24 October 2026. This records the acceptance-stage session; do not treat kickoff or requirements-stage consultation as complete unless separately documented. Record the Kaiārahi’s role, discussion notes and any agreed actions from the session evidence. The fact that the session was held does not by itself imply endorsement; record approval only if it was explicitly given.</w:t>
       </w:r>
     </w:p>
     <w:tbl>
@@ -9041,7 +8832,7 @@
     </w:tbl>
     <w:p>
       <w:r>
-        <w:t>If the Kaiārahi cannot meet before the deadline, the team records the attempts made (dates and messages), says so in the report, and keeps all Māori-specific acceptance criteria marked Not yet confirmed.</w:t>
+        <w:t>Consultation status: held on 24 October 2026. Record the actual advice and any resulting changes from the session. Mark Māori-specific acceptance criteria Not yet confirmed wherever the session did not explicitly confirm them.</w:t>
       </w:r>
     </w:p>
     <w:p>
@@ -10297,12 +10088,7 @@
           </w:tcPr>
           <w:p>
             <w:r>
-              <w:t>Name/signature: Leon</w:t>
-            </w:r>
-            <w:bookmarkStart w:id="0" w:name="_GoBack"/>
-            <w:bookmarkEnd w:id="0"/>
-            <w:r>
-              <w:t xml:space="preserve">; Date: </w:t>
+              <w:t xml:space="preserve">Name/signature: Leon; Date: </w:t>
             </w:r>
             <w:r>
               <w:rPr>
@@ -10605,7 +10391,7 @@
           </w:tcPr>
           <w:p>
             <w:r>
-              <w:t>Sandhya sends the Kaiārahi request and books a session</w:t>
+              <w:t>Sandhya arranges the Kaiārahi consultation, held on 24 October 2026 in Sprint 3</w:t>
             </w:r>
           </w:p>
         </w:tc>
@@ -10647,7 +10433,7 @@
           </w:tcPr>
           <w:p>
             <w:r>
-              <w:t>UA-01 to UA-10 with the test users. Kaiārahi session if booked</w:t>
+              <w:t>UA-01 to UA-10 with the test users. Kaiārahi session held on 24 October 2026; record outcomes</w:t>
             </w:r>
           </w:p>
         </w:tc>
@@ -13589,7 +13375,7 @@
           </w:tcPr>
           <w:p>
             <w:r>
-              <w:t>Kaiārahi consultation has not been held</w:t>
+              <w:t>Kaiārahi consultation held; record its advice and any resulting actions</w:t>
             </w:r>
           </w:p>
         </w:tc>
@@ -13599,7 +13385,7 @@
           </w:tcPr>
           <w:p>
             <w:r>
-              <w:t>Māori-specific acceptance criteria cannot be marked accepted, and the rubric asks for documented consultation</w:t>
+              <w:t>Māori-specific acceptance must reflect what the Kaiārahi explicitly confirmed in the consultation</w:t>
             </w:r>
           </w:p>
         </w:tc>
@@ -13609,7 +13395,7 @@
           </w:tcPr>
           <w:p>
             <w:r>
-              <w:t>Sandhya books a session in Sprint 2 or 3 and records attempts and dates. Never present results as the Kaiārahi's approval</w:t>
+              <w:t>Sandhya records the session notes and any resulting changes. Do not present the consultation itself as the Kaiārahi's approval</w:t>
             </w:r>
           </w:p>
         </w:tc>
@@ -13717,7 +13503,7 @@
           </w:tcPr>
           <w:p>
             <w:r>
-              <w:t>Targets (SUS 68, 80% task success, 1.5 times target time) are the team's proposal</w:t>
+              <w:t>Targets (SUS 68, 80% task success) are the team's proposal</w:t>
             </w:r>
           </w:p>
         </w:tc>
@@ -13809,7 +13595,7 @@
     </w:tbl>
     <w:p>
       <w:r>
-        <w:t>To confirm at the meeting: who owns each test level per sprint and the date for user tests. Sandhya is the contact for the Kaiārahi and reports back with dates.</w:t>
+        <w:t>Record the Kaiārahi consultation notes and any resulting changes. Sandhya is the contact for follow-up.</w:t>
       </w:r>
     </w:p>
     <w:sectPr>

</xml_diff>